<commit_message>
Correct report for lab1
</commit_message>
<xml_diff>
--- a/lab1/Report1.docx
+++ b/lab1/Report1.docx
@@ -49,6 +49,18 @@
           <w:sz w:val="28"/>
           <w:szCs w:val="28"/>
           <w:highlight w:val="none"/>
+          <w:lang w:val="ru-RU"/>
+        </w:rPr>
+      </w:r>
+      <w:r>
+        <w:rPr>
+          <w:rFonts w:ascii="Times New Roman" w:hAnsi="Times New Roman" w:eastAsia="Times New Roman" w:cs="Times New Roman"/>
+          <w:b w:val="0"/>
+          <w:bCs w:val="0"/>
+          <w:sz w:val="28"/>
+          <w:szCs w:val="28"/>
+          <w:highlight w:val="none"/>
+          <w:lang w:val="ru-RU"/>
         </w:rPr>
       </w:r>
     </w:p>
@@ -88,6 +100,18 @@
           <w:sz w:val="28"/>
           <w:szCs w:val="28"/>
           <w:highlight w:val="none"/>
+          <w:lang w:val="ru-RU"/>
+        </w:rPr>
+      </w:r>
+      <w:r>
+        <w:rPr>
+          <w:rFonts w:ascii="Times New Roman" w:hAnsi="Times New Roman" w:eastAsia="Times New Roman" w:cs="Times New Roman"/>
+          <w:b w:val="0"/>
+          <w:bCs w:val="0"/>
+          <w:sz w:val="28"/>
+          <w:szCs w:val="28"/>
+          <w:highlight w:val="none"/>
+          <w:lang w:val="ru-RU"/>
         </w:rPr>
       </w:r>
     </w:p>
@@ -127,6 +151,18 @@
           <w:sz w:val="28"/>
           <w:szCs w:val="28"/>
           <w:highlight w:val="none"/>
+          <w:lang w:val="ru-RU"/>
+        </w:rPr>
+      </w:r>
+      <w:r>
+        <w:rPr>
+          <w:rFonts w:ascii="Times New Roman" w:hAnsi="Times New Roman" w:eastAsia="Times New Roman" w:cs="Times New Roman"/>
+          <w:b w:val="0"/>
+          <w:bCs w:val="0"/>
+          <w:sz w:val="28"/>
+          <w:szCs w:val="28"/>
+          <w:highlight w:val="none"/>
+          <w:lang w:val="ru-RU"/>
         </w:rPr>
       </w:r>
     </w:p>
@@ -404,6 +440,18 @@
           <w:sz w:val="28"/>
           <w:szCs w:val="28"/>
           <w:highlight w:val="none"/>
+          <w:lang w:val="ru-RU"/>
+        </w:rPr>
+      </w:r>
+      <w:r>
+        <w:rPr>
+          <w:rFonts w:ascii="Times New Roman" w:hAnsi="Times New Roman" w:eastAsia="Times New Roman" w:cs="Times New Roman"/>
+          <w:b w:val="0"/>
+          <w:bCs w:val="0"/>
+          <w:sz w:val="28"/>
+          <w:szCs w:val="28"/>
+          <w:highlight w:val="none"/>
+          <w:lang w:val="ru-RU"/>
         </w:rPr>
       </w:r>
     </w:p>
@@ -443,6 +491,18 @@
           <w:sz w:val="28"/>
           <w:szCs w:val="28"/>
           <w:highlight w:val="none"/>
+          <w:lang w:val="ru-RU"/>
+        </w:rPr>
+      </w:r>
+      <w:r>
+        <w:rPr>
+          <w:rFonts w:ascii="Times New Roman" w:hAnsi="Times New Roman" w:eastAsia="Times New Roman" w:cs="Times New Roman"/>
+          <w:b w:val="0"/>
+          <w:bCs w:val="0"/>
+          <w:sz w:val="28"/>
+          <w:szCs w:val="28"/>
+          <w:highlight w:val="none"/>
+          <w:lang w:val="ru-RU"/>
         </w:rPr>
       </w:r>
     </w:p>
@@ -494,6 +554,18 @@
           <w:sz w:val="28"/>
           <w:szCs w:val="28"/>
           <w:highlight w:val="none"/>
+          <w:lang w:val="ru-RU"/>
+        </w:rPr>
+      </w:r>
+      <w:r>
+        <w:rPr>
+          <w:rFonts w:ascii="Times New Roman" w:hAnsi="Times New Roman" w:eastAsia="Times New Roman" w:cs="Times New Roman"/>
+          <w:b w:val="0"/>
+          <w:bCs w:val="0"/>
+          <w:sz w:val="28"/>
+          <w:szCs w:val="28"/>
+          <w:highlight w:val="none"/>
+          <w:lang w:val="ru-RU"/>
         </w:rPr>
       </w:r>
     </w:p>
@@ -533,6 +605,18 @@
           <w:sz w:val="28"/>
           <w:szCs w:val="28"/>
           <w:highlight w:val="none"/>
+          <w:lang w:val="ru-RU"/>
+        </w:rPr>
+      </w:r>
+      <w:r>
+        <w:rPr>
+          <w:rFonts w:ascii="Times New Roman" w:hAnsi="Times New Roman" w:eastAsia="Times New Roman" w:cs="Times New Roman"/>
+          <w:b w:val="0"/>
+          <w:bCs w:val="0"/>
+          <w:sz w:val="28"/>
+          <w:szCs w:val="28"/>
+          <w:highlight w:val="none"/>
+          <w:lang w:val="ru-RU"/>
         </w:rPr>
       </w:r>
     </w:p>
@@ -572,6 +656,18 @@
           <w:sz w:val="28"/>
           <w:szCs w:val="28"/>
           <w:highlight w:val="none"/>
+          <w:lang w:val="ru-RU"/>
+        </w:rPr>
+      </w:r>
+      <w:r>
+        <w:rPr>
+          <w:rFonts w:ascii="Times New Roman" w:hAnsi="Times New Roman" w:eastAsia="Times New Roman" w:cs="Times New Roman"/>
+          <w:b w:val="0"/>
+          <w:bCs w:val="0"/>
+          <w:sz w:val="28"/>
+          <w:szCs w:val="28"/>
+          <w:highlight w:val="none"/>
+          <w:lang w:val="ru-RU"/>
         </w:rPr>
       </w:r>
     </w:p>
@@ -749,6 +845,18 @@
           <w:sz w:val="28"/>
           <w:szCs w:val="28"/>
           <w:highlight w:val="none"/>
+          <w:lang w:val="ru-RU"/>
+        </w:rPr>
+      </w:r>
+      <w:r>
+        <w:rPr>
+          <w:rFonts w:ascii="Times New Roman" w:hAnsi="Times New Roman" w:eastAsia="Times New Roman" w:cs="Times New Roman"/>
+          <w:b w:val="0"/>
+          <w:bCs w:val="0"/>
+          <w:sz w:val="28"/>
+          <w:szCs w:val="28"/>
+          <w:highlight w:val="none"/>
+          <w:lang w:val="ru-RU"/>
         </w:rPr>
       </w:r>
     </w:p>
@@ -788,6 +896,18 @@
           <w:sz w:val="28"/>
           <w:szCs w:val="28"/>
           <w:highlight w:val="none"/>
+          <w:lang w:val="ru-RU"/>
+        </w:rPr>
+      </w:r>
+      <w:r>
+        <w:rPr>
+          <w:rFonts w:ascii="Times New Roman" w:hAnsi="Times New Roman" w:eastAsia="Times New Roman" w:cs="Times New Roman"/>
+          <w:b w:val="0"/>
+          <w:bCs w:val="0"/>
+          <w:sz w:val="28"/>
+          <w:szCs w:val="28"/>
+          <w:highlight w:val="none"/>
+          <w:lang w:val="ru-RU"/>
         </w:rPr>
       </w:r>
     </w:p>
@@ -827,6 +947,18 @@
           <w:sz w:val="28"/>
           <w:szCs w:val="28"/>
           <w:highlight w:val="none"/>
+          <w:lang w:val="ru-RU"/>
+        </w:rPr>
+      </w:r>
+      <w:r>
+        <w:rPr>
+          <w:rFonts w:ascii="Times New Roman" w:hAnsi="Times New Roman" w:eastAsia="Times New Roman" w:cs="Times New Roman"/>
+          <w:b w:val="0"/>
+          <w:bCs w:val="0"/>
+          <w:sz w:val="28"/>
+          <w:szCs w:val="28"/>
+          <w:highlight w:val="none"/>
+          <w:lang w:val="ru-RU"/>
         </w:rPr>
       </w:r>
     </w:p>
@@ -866,6 +998,18 @@
           <w:sz w:val="28"/>
           <w:szCs w:val="28"/>
           <w:highlight w:val="none"/>
+          <w:lang w:val="ru-RU"/>
+        </w:rPr>
+      </w:r>
+      <w:r>
+        <w:rPr>
+          <w:rFonts w:ascii="Times New Roman" w:hAnsi="Times New Roman" w:eastAsia="Times New Roman" w:cs="Times New Roman"/>
+          <w:b w:val="0"/>
+          <w:bCs w:val="0"/>
+          <w:sz w:val="28"/>
+          <w:szCs w:val="28"/>
+          <w:highlight w:val="none"/>
+          <w:lang w:val="ru-RU"/>
         </w:rPr>
       </w:r>
     </w:p>
@@ -905,6 +1049,18 @@
           <w:sz w:val="28"/>
           <w:szCs w:val="28"/>
           <w:highlight w:val="none"/>
+          <w:lang w:val="ru-RU"/>
+        </w:rPr>
+      </w:r>
+      <w:r>
+        <w:rPr>
+          <w:rFonts w:ascii="Times New Roman" w:hAnsi="Times New Roman" w:eastAsia="Times New Roman" w:cs="Times New Roman"/>
+          <w:b w:val="0"/>
+          <w:bCs w:val="0"/>
+          <w:sz w:val="28"/>
+          <w:szCs w:val="28"/>
+          <w:highlight w:val="none"/>
+          <w:lang w:val="ru-RU"/>
         </w:rPr>
       </w:r>
     </w:p>
@@ -932,9 +1088,21 @@
           <w:sz w:val="28"/>
           <w:szCs w:val="28"/>
           <w:highlight w:val="none"/>
+          <w:lang w:val="ru-RU"/>
+        </w:rPr>
+        <w:t xml:space="preserve">ст.преподаватель</w:t>
+      </w:r>
+      <w:r>
+        <w:rPr>
+          <w:rFonts w:ascii="Times New Roman" w:hAnsi="Times New Roman" w:eastAsia="Times New Roman" w:cs="Times New Roman"/>
+          <w:b w:val="0"/>
+          <w:bCs w:val="0"/>
+          <w:sz w:val="28"/>
+          <w:szCs w:val="28"/>
+          <w:highlight w:val="none"/>
           <w:lang w:val="en-US"/>
         </w:rPr>
-        <w:t xml:space="preserve">? </w:t>
+        <w:t xml:space="preserve"> </w:t>
       </w:r>
       <w:r>
         <w:rPr>
@@ -956,6 +1124,18 @@
           <w:sz w:val="28"/>
           <w:szCs w:val="28"/>
           <w:highlight w:val="none"/>
+          <w:lang w:val="ru-RU"/>
+        </w:rPr>
+      </w:r>
+      <w:r>
+        <w:rPr>
+          <w:rFonts w:ascii="Times New Roman" w:hAnsi="Times New Roman" w:eastAsia="Times New Roman" w:cs="Times New Roman"/>
+          <w:b w:val="0"/>
+          <w:bCs w:val="0"/>
+          <w:sz w:val="28"/>
+          <w:szCs w:val="28"/>
+          <w:highlight w:val="none"/>
+          <w:lang w:val="ru-RU"/>
         </w:rPr>
       </w:r>
     </w:p>
@@ -1178,40 +1358,6 @@
           <w:sz w:val="28"/>
           <w:szCs w:val="28"/>
           <w:highlight w:val="none"/>
-          <w:lang w:val="ru-RU"/>
-        </w:rPr>
-      </w:r>
-      <w:r>
-        <w:rPr>
-          <w:rFonts w:ascii="Times New Roman" w:hAnsi="Times New Roman" w:eastAsia="Times New Roman" w:cs="Times New Roman"/>
-          <w:b w:val="0"/>
-          <w:bCs w:val="0"/>
-          <w:sz w:val="28"/>
-          <w:szCs w:val="28"/>
-          <w:highlight w:val="none"/>
-          <w:lang w:val="ru-RU"/>
-        </w:rPr>
-      </w:r>
-      <w:r>
-        <w:rPr>
-          <w:rFonts w:ascii="Times New Roman" w:hAnsi="Times New Roman" w:eastAsia="Times New Roman" w:cs="Times New Roman"/>
-          <w:b/>
-          <w:bCs/>
-          <w:sz w:val="28"/>
-          <w:szCs w:val="28"/>
-          <w:highlight w:val="none"/>
-          <w:lang w:val="ru-RU"/>
-        </w:rPr>
-      </w:r>
-      <w:r>
-        <w:rPr>
-          <w:rFonts w:ascii="Times New Roman" w:hAnsi="Times New Roman" w:eastAsia="Times New Roman" w:cs="Times New Roman"/>
-          <w:b/>
-          <w:bCs/>
-          <w:sz w:val="28"/>
-          <w:szCs w:val="28"/>
-          <w:highlight w:val="none"/>
-          <w:lang w:val="ru-RU"/>
         </w:rPr>
       </w:r>
       <w:r>
@@ -3732,7 +3878,7 @@
           <w:szCs w:val="28"/>
           <w:highlight w:val="none"/>
           <w:vertAlign w:val="baseline"/>
-          <w:lang w:val="ru-RU" w:bidi="ru-RU"/>
+          <w:lang w:val="ru-RU"/>
         </w:rPr>
       </w:r>
       <w:r>
@@ -3766,8 +3912,8 @@
         <w:gridCol w:w="820"/>
         <w:gridCol w:w="820"/>
         <w:gridCol w:w="820"/>
-        <w:gridCol w:w="820"/>
-        <w:gridCol w:w="1984"/>
+        <w:gridCol w:w="823"/>
+        <w:gridCol w:w="1701"/>
       </w:tblGrid>
       <w:tr>
         <w:trPr/>
@@ -3900,7 +4046,7 @@
         <w:tc>
           <w:tcPr>
             <w:tcBorders/>
-            <w:tcW w:w="1984" w:type="dxa"/>
+            <w:tcW w:w="1701" w:type="dxa"/>
             <w:vMerge w:val="restart"/>
           </w:tcPr>
           <w:p>
@@ -4417,7 +4563,7 @@
         <w:tc>
           <w:tcPr>
             <w:tcBorders/>
-            <w:tcW w:w="820" w:type="dxa"/>
+            <w:tcW w:w="823" w:type="dxa"/>
           </w:tcPr>
           <w:p>
             <w:pPr>
@@ -4479,7 +4625,7 @@
         <w:tc>
           <w:tcPr>
             <w:tcBorders/>
-            <w:tcW w:w="1984" w:type="dxa"/>
+            <w:tcW w:w="1701" w:type="dxa"/>
             <w:vMerge w:val="continue"/>
           </w:tcPr>
           <w:p>
@@ -4995,7 +5141,7 @@
         <w:tc>
           <w:tcPr>
             <w:tcBorders/>
-            <w:tcW w:w="820" w:type="dxa"/>
+            <w:tcW w:w="823" w:type="dxa"/>
           </w:tcPr>
           <w:p>
             <w:pPr>
@@ -5057,7 +5203,7 @@
         <w:tc>
           <w:tcPr>
             <w:tcBorders/>
-            <w:tcW w:w="1984" w:type="dxa"/>
+            <w:tcW w:w="1701" w:type="dxa"/>
           </w:tcPr>
           <w:p>
             <w:pPr>
@@ -5070,8 +5216,8 @@
                 <w:b w:val="0"/>
                 <w:bCs w:val="0"/>
                 <w:color w:val="000000" w:themeColor="text1"/>
-                <w:sz w:val="28"/>
-                <w:szCs w:val="28"/>
+                <w:sz w:val="24"/>
+                <w:szCs w:val="24"/>
                 <w:highlight w:val="none"/>
                 <w:vertAlign w:val="baseline"/>
               </w:rPr>
@@ -5082,8 +5228,8 @@
                 <w:b w:val="0"/>
                 <w:bCs w:val="0"/>
                 <w:color w:val="000000" w:themeColor="text1"/>
-                <w:sz w:val="28"/>
-                <w:szCs w:val="28"/>
+                <w:sz w:val="24"/>
+                <w:szCs w:val="24"/>
                 <w:highlight w:val="none"/>
                 <w:vertAlign w:val="baseline"/>
                 <w:lang w:val="ru-RU" w:bidi="ru-RU"/>
@@ -5093,8 +5239,8 @@
               <w:rPr>
                 <w:rFonts w:ascii="Times New Roman" w:hAnsi="Times New Roman" w:eastAsia="Times New Roman" w:cs="Times New Roman"/>
                 <w:color w:val="000000" w:themeColor="text1"/>
-                <w:sz w:val="28"/>
-                <w:szCs w:val="28"/>
+                <w:sz w:val="24"/>
+                <w:szCs w:val="24"/>
                 <w:lang w:val="ru-RU"/>
               </w:rPr>
               <w:t xml:space="preserve">7</w:t>
@@ -5103,8 +5249,8 @@
               <w:rPr>
                 <w:rFonts w:ascii="Times New Roman" w:hAnsi="Times New Roman" w:eastAsia="Times New Roman" w:cs="Times New Roman"/>
                 <w:color w:val="000000" w:themeColor="text1"/>
-                <w:sz w:val="28"/>
-                <w:szCs w:val="28"/>
+                <w:sz w:val="24"/>
+                <w:szCs w:val="24"/>
               </w:rPr>
               <w:t xml:space="preserve"> → </w:t>
             </w:r>
@@ -5112,8 +5258,8 @@
               <w:rPr>
                 <w:rFonts w:ascii="Times New Roman" w:hAnsi="Times New Roman" w:eastAsia="Times New Roman" w:cs="Times New Roman"/>
                 <w:color w:val="000000" w:themeColor="text1"/>
-                <w:sz w:val="28"/>
-                <w:szCs w:val="28"/>
+                <w:sz w:val="24"/>
+                <w:szCs w:val="24"/>
                 <w:lang w:val="en-US"/>
               </w:rPr>
               <w:t xml:space="preserve">R</w:t>
@@ -5122,8 +5268,8 @@
               <w:rPr>
                 <w:rFonts w:ascii="Times New Roman" w:hAnsi="Times New Roman" w:eastAsia="Times New Roman" w:cs="Times New Roman"/>
                 <w:color w:val="000000" w:themeColor="text1"/>
-                <w:sz w:val="28"/>
-                <w:szCs w:val="28"/>
+                <w:sz w:val="24"/>
+                <w:szCs w:val="24"/>
                 <w:vertAlign w:val="subscript"/>
                 <w:lang w:val="ru-RU"/>
               </w:rPr>
@@ -5135,8 +5281,8 @@
                 <w:b w:val="0"/>
                 <w:bCs w:val="0"/>
                 <w:color w:val="000000" w:themeColor="text1"/>
-                <w:sz w:val="28"/>
-                <w:szCs w:val="28"/>
+                <w:sz w:val="24"/>
+                <w:szCs w:val="24"/>
                 <w:highlight w:val="none"/>
                 <w:vertAlign w:val="baseline"/>
               </w:rPr>
@@ -5147,8 +5293,8 @@
                 <w:b w:val="0"/>
                 <w:bCs w:val="0"/>
                 <w:color w:val="000000" w:themeColor="text1"/>
-                <w:sz w:val="28"/>
-                <w:szCs w:val="28"/>
+                <w:sz w:val="24"/>
+                <w:szCs w:val="24"/>
                 <w:highlight w:val="none"/>
                 <w:vertAlign w:val="baseline"/>
               </w:rPr>
@@ -5657,7 +5803,7 @@
         <w:tc>
           <w:tcPr>
             <w:tcBorders/>
-            <w:tcW w:w="820" w:type="dxa"/>
+            <w:tcW w:w="823" w:type="dxa"/>
           </w:tcPr>
           <w:p>
             <w:pPr>
@@ -5719,7 +5865,7 @@
         <w:tc>
           <w:tcPr>
             <w:tcBorders/>
-            <w:tcW w:w="1984" w:type="dxa"/>
+            <w:tcW w:w="1701" w:type="dxa"/>
           </w:tcPr>
           <w:p>
             <w:pPr>
@@ -5732,8 +5878,8 @@
                 <w:b w:val="0"/>
                 <w:bCs w:val="0"/>
                 <w:color w:val="000000" w:themeColor="text1"/>
-                <w:sz w:val="28"/>
-                <w:szCs w:val="28"/>
+                <w:sz w:val="24"/>
+                <w:szCs w:val="24"/>
                 <w:highlight w:val="none"/>
                 <w:vertAlign w:val="baseline"/>
               </w:rPr>
@@ -5744,8 +5890,8 @@
                 <w:b w:val="0"/>
                 <w:bCs w:val="0"/>
                 <w:color w:val="000000" w:themeColor="text1"/>
-                <w:sz w:val="28"/>
-                <w:szCs w:val="28"/>
+                <w:sz w:val="24"/>
+                <w:szCs w:val="24"/>
                 <w:highlight w:val="none"/>
                 <w:vertAlign w:val="baseline"/>
                 <w:lang w:val="ru-RU" w:bidi="ru-RU"/>
@@ -5755,8 +5901,8 @@
               <w:rPr>
                 <w:rFonts w:ascii="Times New Roman" w:hAnsi="Times New Roman" w:eastAsia="Times New Roman" w:cs="Times New Roman"/>
                 <w:color w:val="000000" w:themeColor="text1"/>
-                <w:sz w:val="28"/>
-                <w:szCs w:val="28"/>
+                <w:sz w:val="24"/>
+                <w:szCs w:val="24"/>
                 <w:highlight w:val="none"/>
                 <w:lang w:val="ru-RU"/>
               </w:rPr>
@@ -5766,8 +5912,8 @@
               <w:rPr>
                 <w:rFonts w:ascii="Times New Roman" w:hAnsi="Times New Roman" w:eastAsia="Times New Roman" w:cs="Times New Roman"/>
                 <w:color w:val="000000" w:themeColor="text1"/>
-                <w:sz w:val="28"/>
-                <w:szCs w:val="28"/>
+                <w:sz w:val="24"/>
+                <w:szCs w:val="24"/>
               </w:rPr>
               <w:t xml:space="preserve">→</w:t>
             </w:r>
@@ -5775,8 +5921,8 @@
               <w:rPr>
                 <w:rFonts w:ascii="Times New Roman" w:hAnsi="Times New Roman" w:eastAsia="Times New Roman" w:cs="Times New Roman"/>
                 <w:color w:val="000000" w:themeColor="text1"/>
-                <w:sz w:val="28"/>
-                <w:szCs w:val="28"/>
+                <w:sz w:val="24"/>
+                <w:szCs w:val="24"/>
                 <w:highlight w:val="none"/>
                 <w:lang w:val="ru-RU"/>
               </w:rPr>
@@ -5786,8 +5932,8 @@
               <w:rPr>
                 <w:rFonts w:ascii="Times New Roman" w:hAnsi="Times New Roman" w:eastAsia="Times New Roman" w:cs="Times New Roman"/>
                 <w:color w:val="000000" w:themeColor="text1"/>
-                <w:sz w:val="28"/>
-                <w:szCs w:val="28"/>
+                <w:sz w:val="24"/>
+                <w:szCs w:val="24"/>
                 <w:highlight w:val="none"/>
                 <w:lang w:val="en-US"/>
               </w:rPr>
@@ -5797,8 +5943,8 @@
               <w:rPr>
                 <w:rFonts w:ascii="Times New Roman" w:hAnsi="Times New Roman" w:eastAsia="Times New Roman" w:cs="Times New Roman"/>
                 <w:color w:val="000000" w:themeColor="text1"/>
-                <w:sz w:val="28"/>
-                <w:szCs w:val="28"/>
+                <w:sz w:val="24"/>
+                <w:szCs w:val="24"/>
                 <w:highlight w:val="none"/>
                 <w:vertAlign w:val="subscript"/>
                 <w:lang w:val="en-US"/>
@@ -5811,8 +5957,8 @@
                 <w:b w:val="0"/>
                 <w:bCs w:val="0"/>
                 <w:color w:val="000000" w:themeColor="text1"/>
-                <w:sz w:val="28"/>
-                <w:szCs w:val="28"/>
+                <w:sz w:val="24"/>
+                <w:szCs w:val="24"/>
                 <w:highlight w:val="none"/>
                 <w:vertAlign w:val="baseline"/>
               </w:rPr>
@@ -5823,8 +5969,8 @@
                 <w:b w:val="0"/>
                 <w:bCs w:val="0"/>
                 <w:color w:val="000000" w:themeColor="text1"/>
-                <w:sz w:val="28"/>
-                <w:szCs w:val="28"/>
+                <w:sz w:val="24"/>
+                <w:szCs w:val="24"/>
                 <w:highlight w:val="none"/>
                 <w:vertAlign w:val="baseline"/>
               </w:rPr>
@@ -6333,7 +6479,7 @@
         <w:tc>
           <w:tcPr>
             <w:tcBorders/>
-            <w:tcW w:w="820" w:type="dxa"/>
+            <w:tcW w:w="823" w:type="dxa"/>
           </w:tcPr>
           <w:p>
             <w:pPr>
@@ -6395,7 +6541,7 @@
         <w:tc>
           <w:tcPr>
             <w:tcBorders/>
-            <w:tcW w:w="1984" w:type="dxa"/>
+            <w:tcW w:w="1701" w:type="dxa"/>
           </w:tcPr>
           <w:p>
             <w:pPr>
@@ -6408,8 +6554,8 @@
                 <w:b w:val="0"/>
                 <w:bCs w:val="0"/>
                 <w:color w:val="000000" w:themeColor="text1"/>
-                <w:sz w:val="28"/>
-                <w:szCs w:val="28"/>
+                <w:sz w:val="24"/>
+                <w:szCs w:val="24"/>
                 <w:highlight w:val="none"/>
                 <w:vertAlign w:val="baseline"/>
               </w:rPr>
@@ -6420,8 +6566,8 @@
                 <w:b w:val="0"/>
                 <w:bCs w:val="0"/>
                 <w:color w:val="000000" w:themeColor="text1"/>
-                <w:sz w:val="28"/>
-                <w:szCs w:val="28"/>
+                <w:sz w:val="24"/>
+                <w:szCs w:val="24"/>
                 <w:highlight w:val="none"/>
                 <w:vertAlign w:val="baseline"/>
                 <w:lang w:val="ru-RU" w:bidi="ru-RU"/>
@@ -6431,8 +6577,8 @@
               <w:rPr>
                 <w:rFonts w:ascii="Times New Roman" w:hAnsi="Times New Roman" w:eastAsia="Times New Roman" w:cs="Times New Roman"/>
                 <w:color w:val="000000" w:themeColor="text1"/>
-                <w:sz w:val="28"/>
-                <w:szCs w:val="28"/>
+                <w:sz w:val="24"/>
+                <w:szCs w:val="24"/>
                 <w:highlight w:val="none"/>
                 <w:vertAlign w:val="baseline"/>
                 <w:lang w:val="en-US"/>
@@ -6443,8 +6589,8 @@
               <w:rPr>
                 <w:rFonts w:ascii="Times New Roman" w:hAnsi="Times New Roman" w:eastAsia="Times New Roman" w:cs="Times New Roman"/>
                 <w:color w:val="000000" w:themeColor="text1"/>
-                <w:sz w:val="28"/>
-                <w:szCs w:val="28"/>
+                <w:sz w:val="24"/>
+                <w:szCs w:val="24"/>
                 <w:highlight w:val="none"/>
                 <w:vertAlign w:val="subscript"/>
                 <w:lang w:val="en-US"/>
@@ -6455,8 +6601,8 @@
               <w:rPr>
                 <w:rFonts w:ascii="Times New Roman" w:hAnsi="Times New Roman" w:eastAsia="Times New Roman" w:cs="Times New Roman"/>
                 <w:color w:val="000000" w:themeColor="text1"/>
-                <w:sz w:val="28"/>
-                <w:szCs w:val="28"/>
+                <w:sz w:val="24"/>
+                <w:szCs w:val="24"/>
                 <w:highlight w:val="none"/>
                 <w:vertAlign w:val="baseline"/>
                 <w:lang w:val="en-US"/>
@@ -6467,8 +6613,8 @@
               <w:rPr>
                 <w:rFonts w:ascii="Times New Roman" w:hAnsi="Times New Roman" w:eastAsia="Times New Roman" w:cs="Times New Roman"/>
                 <w:color w:val="000000" w:themeColor="text1"/>
-                <w:sz w:val="28"/>
-                <w:szCs w:val="28"/>
+                <w:sz w:val="24"/>
+                <w:szCs w:val="24"/>
                 <w:highlight w:val="none"/>
                 <w:vertAlign w:val="baseline"/>
                 <w:lang w:val="ru-RU"/>
@@ -6479,8 +6625,8 @@
               <w:rPr>
                 <w:rFonts w:ascii="Times New Roman" w:hAnsi="Times New Roman" w:eastAsia="Times New Roman" w:cs="Times New Roman"/>
                 <w:color w:val="000000" w:themeColor="text1"/>
-                <w:sz w:val="28"/>
-                <w:szCs w:val="28"/>
+                <w:sz w:val="24"/>
+                <w:szCs w:val="24"/>
                 <w:highlight w:val="none"/>
                 <w:vertAlign w:val="baseline"/>
                 <w:lang w:val="en-US"/>
@@ -6491,8 +6637,8 @@
               <w:rPr>
                 <w:rFonts w:ascii="Times New Roman" w:hAnsi="Times New Roman" w:eastAsia="Times New Roman" w:cs="Times New Roman"/>
                 <w:color w:val="000000" w:themeColor="text1"/>
-                <w:sz w:val="28"/>
-                <w:szCs w:val="28"/>
+                <w:sz w:val="24"/>
+                <w:szCs w:val="24"/>
                 <w:highlight w:val="none"/>
                 <w:vertAlign w:val="subscript"/>
                 <w:lang w:val="en-US"/>
@@ -6503,8 +6649,8 @@
               <w:rPr>
                 <w:rFonts w:ascii="Times New Roman" w:hAnsi="Times New Roman" w:eastAsia="Times New Roman" w:cs="Times New Roman"/>
                 <w:color w:val="000000" w:themeColor="text1"/>
-                <w:sz w:val="28"/>
-                <w:szCs w:val="28"/>
+                <w:sz w:val="24"/>
+                <w:szCs w:val="24"/>
                 <w:highlight w:val="none"/>
                 <w:vertAlign w:val="baseline"/>
                 <w:lang w:val="en-US"/>
@@ -6515,8 +6661,8 @@
               <w:rPr>
                 <w:rFonts w:ascii="Times New Roman" w:hAnsi="Times New Roman" w:eastAsia="Times New Roman" w:cs="Times New Roman"/>
                 <w:color w:val="000000" w:themeColor="text1"/>
-                <w:sz w:val="28"/>
-                <w:szCs w:val="28"/>
+                <w:sz w:val="24"/>
+                <w:szCs w:val="24"/>
               </w:rPr>
               <w:t xml:space="preserve">→</w:t>
             </w:r>
@@ -6524,8 +6670,8 @@
               <w:rPr>
                 <w:rFonts w:ascii="Times New Roman" w:hAnsi="Times New Roman" w:eastAsia="Times New Roman" w:cs="Times New Roman"/>
                 <w:color w:val="000000" w:themeColor="text1"/>
-                <w:sz w:val="28"/>
-                <w:szCs w:val="28"/>
+                <w:sz w:val="24"/>
+                <w:szCs w:val="24"/>
                 <w:highlight w:val="none"/>
                 <w:vertAlign w:val="baseline"/>
                 <w:lang w:val="en-US"/>
@@ -6536,8 +6682,8 @@
               <w:rPr>
                 <w:rFonts w:ascii="Times New Roman" w:hAnsi="Times New Roman" w:eastAsia="Times New Roman" w:cs="Times New Roman"/>
                 <w:color w:val="000000" w:themeColor="text1"/>
-                <w:sz w:val="28"/>
-                <w:szCs w:val="28"/>
+                <w:sz w:val="24"/>
+                <w:szCs w:val="24"/>
                 <w:highlight w:val="none"/>
                 <w:vertAlign w:val="subscript"/>
                 <w:lang w:val="en-US"/>
@@ -6550,8 +6696,8 @@
                 <w:b w:val="0"/>
                 <w:bCs w:val="0"/>
                 <w:color w:val="000000" w:themeColor="text1"/>
-                <w:sz w:val="28"/>
-                <w:szCs w:val="28"/>
+                <w:sz w:val="24"/>
+                <w:szCs w:val="24"/>
                 <w:highlight w:val="none"/>
                 <w:vertAlign w:val="baseline"/>
               </w:rPr>
@@ -6562,8 +6708,8 @@
                 <w:b w:val="0"/>
                 <w:bCs w:val="0"/>
                 <w:color w:val="000000" w:themeColor="text1"/>
-                <w:sz w:val="28"/>
-                <w:szCs w:val="28"/>
+                <w:sz w:val="24"/>
+                <w:szCs w:val="24"/>
                 <w:highlight w:val="none"/>
                 <w:vertAlign w:val="baseline"/>
               </w:rPr>
@@ -7072,7 +7218,7 @@
         <w:tc>
           <w:tcPr>
             <w:tcBorders/>
-            <w:tcW w:w="820" w:type="dxa"/>
+            <w:tcW w:w="823" w:type="dxa"/>
           </w:tcPr>
           <w:p>
             <w:pPr>
@@ -7134,7 +7280,7 @@
         <w:tc>
           <w:tcPr>
             <w:tcBorders/>
-            <w:tcW w:w="1984" w:type="dxa"/>
+            <w:tcW w:w="1701" w:type="dxa"/>
           </w:tcPr>
           <w:p>
             <w:pPr>
@@ -7147,8 +7293,8 @@
                 <w:b w:val="0"/>
                 <w:bCs w:val="0"/>
                 <w:color w:val="000000" w:themeColor="text1"/>
-                <w:sz w:val="28"/>
-                <w:szCs w:val="28"/>
+                <w:sz w:val="24"/>
+                <w:szCs w:val="24"/>
                 <w:highlight w:val="none"/>
                 <w:vertAlign w:val="baseline"/>
               </w:rPr>
@@ -7159,8 +7305,8 @@
                 <w:b w:val="0"/>
                 <w:bCs w:val="0"/>
                 <w:color w:val="000000" w:themeColor="text1"/>
-                <w:sz w:val="28"/>
-                <w:szCs w:val="28"/>
+                <w:sz w:val="24"/>
+                <w:szCs w:val="24"/>
                 <w:highlight w:val="none"/>
                 <w:vertAlign w:val="baseline"/>
                 <w:lang w:val="ru-RU" w:bidi="ru-RU"/>
@@ -7170,8 +7316,8 @@
               <w:rPr>
                 <w:rFonts w:ascii="Times New Roman" w:hAnsi="Times New Roman" w:eastAsia="Times New Roman" w:cs="Times New Roman"/>
                 <w:color w:val="000000" w:themeColor="text1"/>
-                <w:sz w:val="28"/>
-                <w:szCs w:val="28"/>
+                <w:sz w:val="24"/>
+                <w:szCs w:val="24"/>
                 <w:highlight w:val="none"/>
                 <w:vertAlign w:val="baseline"/>
                 <w:lang w:val="en-US"/>
@@ -7182,8 +7328,8 @@
               <w:rPr>
                 <w:rFonts w:ascii="Times New Roman" w:hAnsi="Times New Roman" w:eastAsia="Times New Roman" w:cs="Times New Roman"/>
                 <w:color w:val="000000" w:themeColor="text1"/>
-                <w:sz w:val="28"/>
-                <w:szCs w:val="28"/>
+                <w:sz w:val="24"/>
+                <w:szCs w:val="24"/>
                 <w:highlight w:val="none"/>
                 <w:vertAlign w:val="subscript"/>
                 <w:lang w:val="en-US"/>
@@ -7194,8 +7340,8 @@
               <w:rPr>
                 <w:rFonts w:ascii="Times New Roman" w:hAnsi="Times New Roman" w:eastAsia="Times New Roman" w:cs="Times New Roman"/>
                 <w:color w:val="000000" w:themeColor="text1"/>
-                <w:sz w:val="28"/>
-                <w:szCs w:val="28"/>
+                <w:sz w:val="24"/>
+                <w:szCs w:val="24"/>
                 <w:highlight w:val="none"/>
                 <w:vertAlign w:val="baseline"/>
                 <w:lang w:val="en-US"/>
@@ -7206,8 +7352,8 @@
               <w:rPr>
                 <w:rFonts w:ascii="Times New Roman" w:hAnsi="Times New Roman" w:eastAsia="Times New Roman" w:cs="Times New Roman"/>
                 <w:color w:val="000000" w:themeColor="text1"/>
-                <w:sz w:val="28"/>
-                <w:szCs w:val="28"/>
+                <w:sz w:val="24"/>
+                <w:szCs w:val="24"/>
               </w:rPr>
               <w:t xml:space="preserve">→</w:t>
             </w:r>
@@ -7215,8 +7361,8 @@
               <w:rPr>
                 <w:rFonts w:ascii="Times New Roman" w:hAnsi="Times New Roman" w:eastAsia="Times New Roman" w:cs="Times New Roman"/>
                 <w:color w:val="000000" w:themeColor="text1"/>
-                <w:sz w:val="28"/>
-                <w:szCs w:val="28"/>
+                <w:sz w:val="24"/>
+                <w:szCs w:val="24"/>
                 <w:highlight w:val="none"/>
                 <w:vertAlign w:val="baseline"/>
                 <w:lang w:val="en-US"/>
@@ -7227,8 +7373,8 @@
               <w:rPr>
                 <w:rFonts w:ascii="Times New Roman" w:hAnsi="Times New Roman" w:eastAsia="Times New Roman" w:cs="Times New Roman"/>
                 <w:color w:val="000000" w:themeColor="text1"/>
-                <w:sz w:val="28"/>
-                <w:szCs w:val="28"/>
+                <w:sz w:val="24"/>
+                <w:szCs w:val="24"/>
                 <w:highlight w:val="none"/>
                 <w:vertAlign w:val="subscript"/>
                 <w:lang w:val="en-US"/>
@@ -7241,8 +7387,8 @@
                 <w:b w:val="0"/>
                 <w:bCs w:val="0"/>
                 <w:color w:val="000000" w:themeColor="text1"/>
-                <w:sz w:val="28"/>
-                <w:szCs w:val="28"/>
+                <w:sz w:val="24"/>
+                <w:szCs w:val="24"/>
                 <w:highlight w:val="none"/>
                 <w:vertAlign w:val="baseline"/>
               </w:rPr>
@@ -7253,8 +7399,8 @@
                 <w:b w:val="0"/>
                 <w:bCs w:val="0"/>
                 <w:color w:val="000000" w:themeColor="text1"/>
-                <w:sz w:val="28"/>
-                <w:szCs w:val="28"/>
+                <w:sz w:val="24"/>
+                <w:szCs w:val="24"/>
                 <w:highlight w:val="none"/>
                 <w:vertAlign w:val="baseline"/>
               </w:rPr>

</xml_diff>